<commit_message>
Unificar la marca a Magnatic y completar la PPT con pasos, loop, chatbots, versiones, software vs IA y niveles.
Co-authored-by: Cursor <cursoragent@cursor.com>
</commit_message>
<xml_diff>
--- a/Guia-Facilitacion-Aula.docx
+++ b/Guia-Facilitacion-Aula.docx
@@ -25,7 +25,7 @@
           <w:i/>
           <w:color w:val="666666"/>
         </w:rPr>
-        <w:t xml:space="preserve">Instructor MagnaTic. Version extensa: docs/GUIA-FACILITACION-AULA.md. Sitio: https://xander0408.github.io/CURSOS/ (barra final).</w:t>
+        <w:t xml:space="preserve">Instructor Magnatic. Version extensa: docs/GUIA-FACILITACION-AULA.md. Sitio: https://xander0408.github.io/CURSOS/ (barra final).</w:t>
       </w:r>
     </w:p>
     <w:p>
@@ -47,7 +47,7 @@
         <w:spacing w:after="120"/>
       </w:pPr>
       <w:r>
-        <w:t xml:space="preserve">Diles: Chrome o Edge normal, no incognito. URL con barra al final. Esperan el logo MagnaTic. Tres pestanas: laboratorio, ChatGPT, Claude. Claves en privado, nunca en el proyector.</w:t>
+        <w:t xml:space="preserve">Diles: Chrome o Edge normal, no incognito. URL con barra al final. Esperan el logo Magnatic. Tres pestanas: laboratorio, ChatGPT, Claude. Claves en privado, nunca en el proyector.</w:t>
       </w:r>
     </w:p>
     <w:p>

</xml_diff>